<commit_message>
Se agregan credenciales de selenitus
</commit_message>
<xml_diff>
--- a/guia para ver mi pagina.docx
+++ b/guia para ver mi pagina.docx
@@ -4,6 +4,9 @@
   <w:body>
     <w:p>
       <w:r>
+        <w:rPr>
+          <w:noProof/>
+        </w:rPr>
         <w:drawing>
           <wp:inline distT="0" distB="0" distL="0" distR="0" wp14:anchorId="77080574" wp14:editId="09C63226">
             <wp:extent cx="4324954" cy="1838582"/>
@@ -40,6 +43,121 @@
           </wp:inline>
         </w:drawing>
       </w:r>
+    </w:p>
+    <w:p/>
+    <w:p>
+      <w:r>
+        <w:t>Guia para ir actualizando los cambios desde el VSC al GitHub</w:t>
+      </w:r>
+    </w:p>
+    <w:p/>
+    <w:p>
+      <w:r>
+        <w:t># 1. Ver qué archivos cambiaste (opcional, pero recomendado)</w:t>
+      </w:r>
+    </w:p>
+    <w:p>
+      <w:proofErr w:type="spellStart"/>
+      <w:r>
+        <w:t>git</w:t>
+      </w:r>
+      <w:proofErr w:type="spellEnd"/>
+      <w:r>
+        <w:t xml:space="preserve"> status</w:t>
+      </w:r>
+    </w:p>
+    <w:p/>
+    <w:p>
+      <w:r>
+        <w:t># 2. Agregar todos los archivos modificados</w:t>
+      </w:r>
+    </w:p>
+    <w:p>
+      <w:proofErr w:type="spellStart"/>
+      <w:r>
+        <w:t>git</w:t>
+      </w:r>
+      <w:proofErr w:type="spellEnd"/>
+      <w:r>
+        <w:t xml:space="preserve"> </w:t>
+      </w:r>
+      <w:proofErr w:type="spellStart"/>
+      <w:r>
+        <w:t>add</w:t>
+      </w:r>
+      <w:proofErr w:type="spellEnd"/>
+      <w:r>
+        <w:t xml:space="preserve"> .</w:t>
+      </w:r>
+    </w:p>
+    <w:p/>
+    <w:p>
+      <w:r>
+        <w:t xml:space="preserve"># 3. Hacer </w:t>
+      </w:r>
+      <w:proofErr w:type="spellStart"/>
+      <w:r>
+        <w:t>commit</w:t>
+      </w:r>
+      <w:proofErr w:type="spellEnd"/>
+      <w:r>
+        <w:t xml:space="preserve"> con un mensaje descriptivo</w:t>
+      </w:r>
+    </w:p>
+    <w:p>
+      <w:proofErr w:type="spellStart"/>
+      <w:r>
+        <w:t>git</w:t>
+      </w:r>
+      <w:proofErr w:type="spellEnd"/>
+      <w:r>
+        <w:t xml:space="preserve"> </w:t>
+      </w:r>
+      <w:proofErr w:type="spellStart"/>
+      <w:r>
+        <w:t>commit</w:t>
+      </w:r>
+      <w:proofErr w:type="spellEnd"/>
+      <w:r>
+        <w:t xml:space="preserve"> -m "Descripción de los cambios que hiciste"</w:t>
+      </w:r>
+    </w:p>
+    <w:p/>
+    <w:p>
+      <w:r>
+        <w:t># 4. Subir los cambios a GitHub</w:t>
+      </w:r>
+    </w:p>
+    <w:p>
+      <w:proofErr w:type="spellStart"/>
+      <w:r>
+        <w:t>git</w:t>
+      </w:r>
+      <w:proofErr w:type="spellEnd"/>
+      <w:r>
+        <w:t xml:space="preserve"> </w:t>
+      </w:r>
+      <w:proofErr w:type="spellStart"/>
+      <w:r>
+        <w:t>push</w:t>
+      </w:r>
+      <w:proofErr w:type="spellEnd"/>
+      <w:r>
+        <w:t xml:space="preserve"> </w:t>
+      </w:r>
+      <w:proofErr w:type="spellStart"/>
+      <w:r>
+        <w:t>origin</w:t>
+      </w:r>
+      <w:proofErr w:type="spellEnd"/>
+      <w:r>
+        <w:t xml:space="preserve"> </w:t>
+      </w:r>
+      <w:proofErr w:type="spellStart"/>
+      <w:r>
+        <w:t>main</w:t>
+      </w:r>
+      <w:proofErr w:type="spellEnd"/>
     </w:p>
     <w:sectPr>
       <w:pgSz w:w="11906" w:h="16838"/>

</xml_diff>